<commit_message>
Formatierung in Platzhalter-Absätzen erhalten, kleine Korrekturen
- Word-Engine: Ein aufgeteilter Platzhalter wird nur noch in den Lauf
  verschoben, in dem er beginnt. Die übrigen Läufe behalten ihre
  Formatierung (vorher galt die des ersten Laufs für den ganzen Absatz).
- Vorlage: „Service Requests:“ und „Nicht enthalten:“ nur als fettes
  Stichwort; Spalte „Einheit“ der Preistabelle breiter.
- Angebote: Hinweis, wenn es zu einer Kalkulation noch kein Angebot gibt.
- Kundenprojekte: ohne Berechtigung weder Unterzeile noch Suche.

Co-Authored-By: Claude Opus 5.5 <noreply@anthropic.com>
Claude-Session: https://claude.ai/code/session_01KXwsZXuLnhXkK3KnwTqQAa
</commit_message>
<xml_diff>
--- a/templates/angebot/Angebotsvorlage.docx
+++ b/templates/angebot/Angebotsvorlage.docx
@@ -1524,7 +1524,15 @@
           <w:sz w:val="18"/>
           <w:szCs w:val="18"/>
         </w:rPr>
-        <w:t xml:space="preserve">Nicht enthalten: {{nicht_enthalten}}</w:t>
+        <w:t xml:space="preserve">Nicht enthalten:</w:t>
+      </w:r>
+      <w:r>
+        <w:rPr>
+          <w:rFonts w:ascii="Verdana" w:cs="Verdana" w:eastAsia="Verdana" w:hAnsi="Verdana"/>
+          <w:sz w:val="18"/>
+          <w:szCs w:val="18"/>
+        </w:rPr>
+        <w:t xml:space="preserve"> {{nicht_enthalten}}</w:t>
       </w:r>
       <w:r>
         <w:rPr>
@@ -1617,8 +1625,8 @@
       </w:tblPr>
       <w:tblGrid>
         <w:gridCol w:w="800"/>
-        <w:gridCol w:w="3738"/>
-        <w:gridCol w:w="1300"/>
+        <w:gridCol w:w="3038"/>
+        <w:gridCol w:w="2000"/>
         <w:gridCol w:w="900"/>
         <w:gridCol w:w="1450"/>
         <w:gridCol w:w="1450"/>
@@ -1664,7 +1672,7 @@
         </w:tc>
         <w:tc>
           <w:tcPr>
-            <w:tcW w:type="dxa" w:w="3738"/>
+            <w:tcW w:type="dxa" w:w="3038"/>
             <w:tcBorders>
               <w:top w:val="single" w:color="D0D7DA" w:sz="4"/>
               <w:left w:val="none" w:color="FFFFFF" w:sz="0"/>
@@ -1699,7 +1707,7 @@
         </w:tc>
         <w:tc>
           <w:tcPr>
-            <w:tcW w:type="dxa" w:w="1300"/>
+            <w:tcW w:type="dxa" w:w="2000"/>
             <w:tcBorders>
               <w:top w:val="single" w:color="D0D7DA" w:sz="4"/>
               <w:left w:val="none" w:color="FFFFFF" w:sz="0"/>
@@ -1873,7 +1881,7 @@
         </w:tc>
         <w:tc>
           <w:tcPr>
-            <w:tcW w:type="dxa" w:w="3738"/>
+            <w:tcW w:type="dxa" w:w="3038"/>
             <w:tcBorders>
               <w:top w:val="single" w:color="D0D7DA" w:sz="4"/>
               <w:left w:val="none" w:color="FFFFFF" w:sz="0"/>
@@ -1905,7 +1913,7 @@
         </w:tc>
         <w:tc>
           <w:tcPr>
-            <w:tcW w:type="dxa" w:w="1300"/>
+            <w:tcW w:type="dxa" w:w="2000"/>
             <w:tcBorders>
               <w:top w:val="single" w:color="D0D7DA" w:sz="4"/>
               <w:left w:val="none" w:color="FFFFFF" w:sz="0"/>
@@ -2066,7 +2074,7 @@
         </w:tc>
         <w:tc>
           <w:tcPr>
-            <w:tcW w:type="dxa" w:w="3738"/>
+            <w:tcW w:type="dxa" w:w="3038"/>
             <w:tcBorders>
               <w:top w:val="single" w:color="006C88" w:sz="12"/>
               <w:left w:val="none" w:color="FFFFFF" w:sz="0"/>
@@ -2099,7 +2107,7 @@
         </w:tc>
         <w:tc>
           <w:tcPr>
-            <w:tcW w:type="dxa" w:w="1300"/>
+            <w:tcW w:type="dxa" w:w="2000"/>
             <w:tcBorders>
               <w:top w:val="single" w:color="006C88" w:sz="12"/>
               <w:left w:val="none" w:color="FFFFFF" w:sz="0"/>
@@ -2775,7 +2783,15 @@
           <w:sz w:val="18"/>
           <w:szCs w:val="18"/>
         </w:rPr>
-        <w:t xml:space="preserve">Service Requests: Betrieb und Störungsbehebung an den betreuten Systemen sind inklusive. Veränderungen und neue Leistungen werden nach Aufwand in Abrechnungseinheiten (1 AE = 15 Minuten) berechnet: Ebene 1: {{satz.ebene1}} · Ebene 2 (Standard): {{satz.ebene2}} · Ebene 3: {{satz.ebene3}} je AE.</w:t>
+        <w:t xml:space="preserve">Service Requests:</w:t>
+      </w:r>
+      <w:r>
+        <w:rPr>
+          <w:rFonts w:ascii="Verdana" w:cs="Verdana" w:eastAsia="Verdana" w:hAnsi="Verdana"/>
+          <w:sz w:val="18"/>
+          <w:szCs w:val="18"/>
+        </w:rPr>
+        <w:t xml:space="preserve"> Betrieb und Störungsbehebung an den betreuten Systemen sind inklusive. Veränderungen und neue Leistungen werden nach Aufwand in Abrechnungseinheiten (1 AE = 15 Minuten) berechnet: Ebene 1: {{satz.ebene1}} · Ebene 2 (Standard): {{satz.ebene2}} · Ebene 3: {{satz.ebene3}} je AE.</w:t>
       </w:r>
       <w:r>
         <w:rPr>

</xml_diff>